<commit_message>
paper: integrate E5 and E6 evidence
</commit_message>
<xml_diff>
--- a/docs/research/paper_v2/manuscript/M3_PI_Guard_JISA_cover_letter.docx
+++ b/docs/research/paper_v2/manuscript/M3_PI_Guard_JISA_cover_letter.docx
@@ -61,7 +61,7 @@
         <w:jc w:val="left"/>
       </w:pPr>
       <w:r>
-        <w:t>Across completed public experiments with DeepSeek V4 Pro and V4 Flash, the full configuration package reduced unsafe effects relative to a structural baseline but did not outperform the policy package. The comparison is explicitly reported as bundled because prompt profile and runtime modules change together. A prospectively frozen 900-work-item authorization study further showed that pooled utility effects reversed by benchmark: exact authorization improved AgentDojo completion but reduced both M3-v2 configuration cells to 0/30. The pessimistic unsafe-or-failure bound also increased from 7% to 25% under the policy package and from 8% to 26% under the full package. In a separate defense-aware panel, first unsafe effects increased from 4/40 tasks by query 50 to 18/40 by query 200, demonstrating why a single low attack budget is an incomplete evaluation.</w:t>
+        <w:t>Across completed public experiments with DeepSeek V4 Pro and V4 Flash, the full configuration package reduced unsafe effects relative to a structural baseline but did not outperform the policy package. A contemporaneous 2×2 experiment subsequently separated the prompt profile from the runtime module bundle and found no clear positive module, prompt, or interaction contribution. A prospectively frozen 900-work-item authorization study further showed that pooled utility effects reversed by benchmark: exact authorization improved AgentDojo completion but reduced both M3-v2 configuration cells to 0/30. The pessimistic unsafe-or-failure bound also increased from 7% to 25% under the policy package and from 8% to 26% under the full package. A controlled source-authority experiment showed provenance-sensitive full-Guard decisions, but all end-to-end actions remained blocked or pending confirmation. In a separate defense-aware panel, first unsafe effects increased from 4/40 tasks by query 50 to 18/40 by query 200, demonstrating why a single low attack budget is an incomplete evaluation. None of 12 prespecified B200 survivors first succeeded by query 500, but the Wilson upper limit remained 24.25%. A separately executed, historically risk-enriched single block observed 17/60 no-defense unsafe effects, while policy/normal and full/safe produced 2/60 and 0/60; 47/60 tasks overlapped the E3 challenge sample. This conditional result is not a deployment-rate, utility, temporal-repeatability, independent-sample, or isolated-module claim. Two incomplete Gemini attempts leave cross-provider effects not estimable.</w:t>
       </w:r>
     </w:p>
     <w:p>
@@ -69,7 +69,7 @@
         <w:jc w:val="left"/>
       </w:pPr>
       <w:r>
-        <w:t>The manuscript fits the journal’s focus on access control, security policy, and practical information-security systems. Its contribution is an empirical evaluation method and a bounded account of security–utility trade-offs, not a claim of a universally leading defense. We believe the bounded configuration comparison, paired authorization analysis, two public benchmarks, and explicit accounting of failures and system confirmation requests will be useful to researchers and practitioners evaluating security controls for tool-using agents.</w:t>
+        <w:t>The manuscript fits the journal’s focus on access control, security policy, and practical information-security systems. Its contribution is an empirical evaluation method and a bounded account of security–utility trade-offs, not a claim of a universally leading defense. We believe the bounded configuration comparison, factorial analysis, source-only counterfactual, two public benchmarks, and explicit accounting of failures and system confirmation requests will be useful to researchers and practitioners evaluating security controls for tool-using agents.</w:t>
       </w:r>
     </w:p>
     <w:p>
@@ -529,11 +529,11 @@
     <w:qFormat/>
     <w:rsid w:val="00FC693F"/>
     <w:pPr>
-      <w:spacing w:before="0" w:after="120" w:line="264" w:lineRule="auto"/>
+      <w:spacing w:before="0" w:after="80" w:line="240" w:lineRule="auto"/>
     </w:pPr>
     <w:rPr>
       <w:rFonts w:ascii="Calibri" w:hAnsi="Calibri" w:eastAsia="Calibri"/>
-      <w:sz w:val="22"/>
+      <w:sz w:val="21"/>
     </w:rPr>
   </w:style>
   <w:style w:type="paragraph" w:styleId="Header">

</xml_diff>